<commit_message>
Update: Actualización de los certificados, en docx y en PDF
</commit_message>
<xml_diff>
--- a/src/assets/descargas/certificado_buen_alumno.docx
+++ b/src/assets/descargas/certificado_buen_alumno.docx
@@ -12,7 +12,7 @@
           <w:noProof/>
         </w:rPr>
         <w:drawing>
-          <wp:anchor distT="0" distB="0" distL="114300" distR="114300" simplePos="0" relativeHeight="251658240" behindDoc="0" locked="0" layoutInCell="1" allowOverlap="1" wp14:anchorId="76012A41" wp14:editId="5A523720">
+          <wp:anchor distT="0" distB="0" distL="114300" distR="114300" simplePos="0" relativeHeight="251658240" behindDoc="0" locked="0" layoutInCell="1" allowOverlap="1" wp14:anchorId="76012A41" wp14:editId="417FB4FE">
             <wp:simplePos x="0" y="0"/>
             <wp:positionH relativeFrom="margin">
               <wp:align>center</wp:align>
@@ -37,7 +37,7 @@
                     </pic:cNvPicPr>
                   </pic:nvPicPr>
                   <pic:blipFill>
-                    <a:blip r:embed="rId7" cstate="print">
+                    <a:blip r:embed="rId8" cstate="print">
                       <a:extLst>
                         <a:ext uri="{28A0092B-C50C-407E-A947-70E740481C1C}">
                           <a14:useLocalDpi xmlns:a14="http://schemas.microsoft.com/office/drawing/2010/main" val="0"/>
@@ -183,155 +183,302 @@
         <w:jc w:val="center"/>
       </w:pPr>
       <w:r>
-        <w:t>ha demostrado a lo largo del curso un comportamiento ejemplar, una actitud responsable y un esfuerzo constante en sus tareas escolares, haciéndose merecedor/a del presente reconocimiento como muestra de felicitación por parte de su centro educativo.</w:t>
+        <w:t xml:space="preserve">ha demostrado a lo largo del curso un comportamiento ejemplar, una actitud responsable y un esfuerzo constante en </w:t>
+      </w:r>
+      <w:proofErr w:type="gramStart"/>
+      <w:r>
+        <w:t>sus tarea</w:t>
+      </w:r>
+      <w:proofErr w:type="gramEnd"/>
+      <w:r>
+        <w:t>, no quedándose demasiado dormido/a en clase</w:t>
+      </w:r>
+      <w:r>
+        <w:t>, haciéndose merecedor/a del presente reconocimiento como muestra de felicitación por parte de su centro educativo.</w:t>
       </w:r>
     </w:p>
     <w:p>
       <w:pPr>
         <w:spacing w:after="1000"/>
         <w:jc w:val="center"/>
-      </w:pPr>
-      <w:proofErr w:type="spellStart"/>
-      <w:r>
         <w:rPr>
           <w:color w:val="555555"/>
           <w:sz w:val="20"/>
           <w:szCs w:val="20"/>
         </w:rPr>
-        <w:t>Ejemplolandia</w:t>
-      </w:r>
-      <w:proofErr w:type="spellEnd"/>
+      </w:pPr>
+      <w:r>
+        <w:rPr>
+          <w:noProof/>
+        </w:rPr>
+        <w:drawing>
+          <wp:anchor distT="0" distB="0" distL="114300" distR="114300" simplePos="0" relativeHeight="251659264" behindDoc="1" locked="0" layoutInCell="1" allowOverlap="1" wp14:anchorId="6AE7B776" wp14:editId="6A4033E7">
+            <wp:simplePos x="0" y="0"/>
+            <wp:positionH relativeFrom="margin">
+              <wp:align>center</wp:align>
+            </wp:positionH>
+            <wp:positionV relativeFrom="paragraph">
+              <wp:posOffset>551751</wp:posOffset>
+            </wp:positionV>
+            <wp:extent cx="2110633" cy="2950669"/>
+            <wp:effectExtent l="0" t="0" r="0" b="0"/>
+            <wp:wrapNone/>
+            <wp:docPr id="1052875435" name="Imagen 2"/>
+            <wp:cNvGraphicFramePr>
+              <a:graphicFrameLocks xmlns:a="http://schemas.openxmlformats.org/drawingml/2006/main" noChangeAspect="1"/>
+            </wp:cNvGraphicFramePr>
+            <a:graphic xmlns:a="http://schemas.openxmlformats.org/drawingml/2006/main">
+              <a:graphicData uri="http://schemas.openxmlformats.org/drawingml/2006/picture">
+                <pic:pic xmlns:pic="http://schemas.openxmlformats.org/drawingml/2006/picture">
+                  <pic:nvPicPr>
+                    <pic:cNvPr id="0" name="Picture 3"/>
+                    <pic:cNvPicPr>
+                      <a:picLocks noChangeAspect="1" noChangeArrowheads="1"/>
+                    </pic:cNvPicPr>
+                  </pic:nvPicPr>
+                  <pic:blipFill>
+                    <a:blip r:embed="rId9" cstate="print">
+                      <a:alphaModFix amt="50000"/>
+                      <a:extLst>
+                        <a:ext uri="{28A0092B-C50C-407E-A947-70E740481C1C}">
+                          <a14:useLocalDpi xmlns:a14="http://schemas.microsoft.com/office/drawing/2010/main" val="0"/>
+                        </a:ext>
+                      </a:extLst>
+                    </a:blip>
+                    <a:srcRect/>
+                    <a:stretch>
+                      <a:fillRect/>
+                    </a:stretch>
+                  </pic:blipFill>
+                  <pic:spPr bwMode="auto">
+                    <a:xfrm>
+                      <a:off x="0" y="0"/>
+                      <a:ext cx="2110633" cy="2950669"/>
+                    </a:xfrm>
+                    <a:prstGeom prst="rect">
+                      <a:avLst/>
+                    </a:prstGeom>
+                    <a:noFill/>
+                    <a:ln>
+                      <a:noFill/>
+                    </a:ln>
+                  </pic:spPr>
+                </pic:pic>
+              </a:graphicData>
+            </a:graphic>
+            <wp14:sizeRelH relativeFrom="margin">
+              <wp14:pctWidth>0</wp14:pctWidth>
+            </wp14:sizeRelH>
+            <wp14:sizeRelV relativeFrom="margin">
+              <wp14:pctHeight>0</wp14:pctHeight>
+            </wp14:sizeRelV>
+          </wp:anchor>
+        </w:drawing>
+      </w:r>
+      <w:proofErr w:type="spellStart"/>
       <w:r>
         <w:rPr>
           <w:color w:val="555555"/>
           <w:sz w:val="20"/>
           <w:szCs w:val="20"/>
         </w:rPr>
-        <w:t xml:space="preserve">, a ____ </w:t>
-      </w:r>
-      <w:proofErr w:type="spellStart"/>
+        <w:t>Ejemplolandia</w:t>
+      </w:r>
+      <w:proofErr w:type="spellEnd"/>
       <w:r>
         <w:rPr>
           <w:color w:val="555555"/>
           <w:sz w:val="20"/>
           <w:szCs w:val="20"/>
         </w:rPr>
-        <w:t>de</w:t>
-      </w:r>
-      <w:proofErr w:type="spellEnd"/>
+        <w:t xml:space="preserve">, a ____ </w:t>
+      </w:r>
+      <w:proofErr w:type="spellStart"/>
       <w:r>
         <w:rPr>
           <w:color w:val="555555"/>
           <w:sz w:val="20"/>
           <w:szCs w:val="20"/>
         </w:rPr>
-        <w:t xml:space="preserve"> ______________ </w:t>
-      </w:r>
-      <w:proofErr w:type="spellStart"/>
+        <w:t>de</w:t>
+      </w:r>
+      <w:proofErr w:type="spellEnd"/>
       <w:r>
         <w:rPr>
           <w:color w:val="555555"/>
           <w:sz w:val="20"/>
           <w:szCs w:val="20"/>
         </w:rPr>
-        <w:t>de</w:t>
-      </w:r>
-      <w:proofErr w:type="spellEnd"/>
+        <w:t xml:space="preserve"> ______________ </w:t>
+      </w:r>
+      <w:proofErr w:type="spellStart"/>
       <w:r>
         <w:rPr>
           <w:color w:val="555555"/>
           <w:sz w:val="20"/>
           <w:szCs w:val="20"/>
         </w:rPr>
+        <w:t>de</w:t>
+      </w:r>
+      <w:proofErr w:type="spellEnd"/>
+      <w:r>
+        <w:rPr>
+          <w:color w:val="555555"/>
+          <w:sz w:val="20"/>
+          <w:szCs w:val="20"/>
+        </w:rPr>
         <w:t xml:space="preserve"> 2026</w:t>
       </w:r>
     </w:p>
     <w:p>
       <w:pPr>
-        <w:spacing w:before="800"/>
+        <w:spacing w:after="1000"/>
         <w:jc w:val="center"/>
-      </w:pPr>
-      <w:r>
-        <w:t>______________________          ______________________</w:t>
-      </w:r>
-    </w:p>
-    <w:p>
-      <w:pPr>
-        <w:spacing w:before="40" w:after="600"/>
-        <w:ind w:left="708" w:firstLine="708"/>
-      </w:pPr>
-      <w:r>
-        <w:rPr>
-          <w:rFonts w:ascii="Arial" w:eastAsia="Arial" w:hAnsi="Arial" w:cs="Arial"/>
-          <w:b/>
-          <w:bCs/>
-          <w:color w:val="1A2E4A"/>
-          <w:sz w:val="18"/>
-          <w:szCs w:val="18"/>
-        </w:rPr>
-        <w:t>Dirección del Centro</w:t>
-      </w:r>
-      <w:r>
-        <w:rPr>
-          <w:sz w:val="18"/>
-          <w:szCs w:val="18"/>
-        </w:rPr>
-        <w:t xml:space="preserve">  </w:t>
-      </w:r>
-      <w:r>
-        <w:rPr>
-          <w:sz w:val="18"/>
-          <w:szCs w:val="18"/>
-        </w:rPr>
-        <w:tab/>
-      </w:r>
-      <w:r>
-        <w:rPr>
-          <w:sz w:val="18"/>
-          <w:szCs w:val="18"/>
-        </w:rPr>
-        <w:tab/>
-      </w:r>
-      <w:r>
-        <w:rPr>
-          <w:sz w:val="18"/>
-          <w:szCs w:val="18"/>
-        </w:rPr>
-        <w:t xml:space="preserve">          </w:t>
-      </w:r>
-      <w:r>
-        <w:rPr>
-          <w:sz w:val="18"/>
-          <w:szCs w:val="18"/>
-        </w:rPr>
-        <w:t xml:space="preserve">  </w:t>
-      </w:r>
-      <w:r>
-        <w:rPr>
-          <w:sz w:val="18"/>
-          <w:szCs w:val="18"/>
-        </w:rPr>
-        <w:t xml:space="preserve">        </w:t>
-      </w:r>
-      <w:r>
-        <w:rPr>
-          <w:rFonts w:ascii="Arial" w:eastAsia="Arial" w:hAnsi="Arial" w:cs="Arial"/>
-          <w:b/>
-          <w:bCs/>
-          <w:color w:val="1A2E4A"/>
-          <w:sz w:val="18"/>
-          <w:szCs w:val="18"/>
-        </w:rPr>
-        <w:t>Tutor/a</w:t>
-      </w:r>
+        <w:rPr>
+          <w:color w:val="555555"/>
+          <w:sz w:val="20"/>
+          <w:szCs w:val="20"/>
+        </w:rPr>
+      </w:pPr>
+    </w:p>
+    <w:p>
+      <w:pPr>
+        <w:spacing w:after="1000"/>
+        <w:jc w:val="center"/>
+        <w:rPr>
+          <w:color w:val="555555"/>
+          <w:sz w:val="20"/>
+          <w:szCs w:val="20"/>
+        </w:rPr>
+      </w:pPr>
+    </w:p>
+    <w:tbl>
+      <w:tblPr>
+        <w:tblpPr w:leftFromText="141" w:rightFromText="141" w:vertAnchor="text" w:horzAnchor="margin" w:tblpXSpec="center" w:tblpY="19"/>
+        <w:tblW w:w="0" w:type="auto"/>
+        <w:tblCellMar>
+          <w:left w:w="70" w:type="dxa"/>
+          <w:right w:w="70" w:type="dxa"/>
+        </w:tblCellMar>
+        <w:tblLook w:val="0000" w:firstRow="0" w:lastRow="0" w:firstColumn="0" w:lastColumn="0" w:noHBand="0" w:noVBand="0"/>
+      </w:tblPr>
+      <w:tblGrid>
+        <w:gridCol w:w="4451"/>
+        <w:gridCol w:w="4645"/>
+      </w:tblGrid>
+      <w:tr>
+        <w:tblPrEx>
+          <w:tblCellMar>
+            <w:top w:w="0" w:type="dxa"/>
+            <w:bottom w:w="0" w:type="dxa"/>
+          </w:tblCellMar>
+        </w:tblPrEx>
+        <w:trPr>
+          <w:trHeight w:val="1309"/>
+        </w:trPr>
+        <w:tc>
+          <w:tcPr>
+            <w:tcW w:w="4451" w:type="dxa"/>
+            <w:vAlign w:val="center"/>
+          </w:tcPr>
+          <w:p>
+            <w:pPr>
+              <w:spacing w:after="1000"/>
+              <w:jc w:val="center"/>
+              <w:rPr>
+                <w:color w:val="555555"/>
+                <w:sz w:val="20"/>
+                <w:szCs w:val="20"/>
+              </w:rPr>
+            </w:pPr>
+            <w:r>
+              <w:rPr>
+                <w:color w:val="555555"/>
+                <w:sz w:val="20"/>
+                <w:szCs w:val="20"/>
+              </w:rPr>
+              <w:t>Dirección del centro</w:t>
+            </w:r>
+            <w:r>
+              <w:rPr>
+                <w:color w:val="555555"/>
+                <w:sz w:val="20"/>
+                <w:szCs w:val="20"/>
+              </w:rPr>
+              <w:br/>
+            </w:r>
+            <w:r>
+              <w:rPr>
+                <w:color w:val="555555"/>
+                <w:sz w:val="20"/>
+                <w:szCs w:val="20"/>
+              </w:rPr>
+              <w:br/>
+              <w:t>---------------------------------------</w:t>
+            </w:r>
+          </w:p>
+        </w:tc>
+        <w:tc>
+          <w:tcPr>
+            <w:tcW w:w="4645" w:type="dxa"/>
+            <w:vAlign w:val="center"/>
+          </w:tcPr>
+          <w:p>
+            <w:pPr>
+              <w:spacing w:after="1000"/>
+              <w:jc w:val="center"/>
+              <w:rPr>
+                <w:color w:val="555555"/>
+                <w:sz w:val="20"/>
+                <w:szCs w:val="20"/>
+              </w:rPr>
+            </w:pPr>
+            <w:r>
+              <w:rPr>
+                <w:color w:val="555555"/>
+                <w:sz w:val="20"/>
+                <w:szCs w:val="20"/>
+              </w:rPr>
+              <w:t>Tutor/a</w:t>
+            </w:r>
+            <w:r>
+              <w:rPr>
+                <w:color w:val="555555"/>
+                <w:sz w:val="20"/>
+                <w:szCs w:val="20"/>
+              </w:rPr>
+              <w:br/>
+            </w:r>
+            <w:r>
+              <w:rPr>
+                <w:color w:val="555555"/>
+                <w:sz w:val="20"/>
+                <w:szCs w:val="20"/>
+              </w:rPr>
+              <w:br/>
+              <w:t>---------------------------------------</w:t>
+            </w:r>
+          </w:p>
+        </w:tc>
+      </w:tr>
+    </w:tbl>
+    <w:p>
+      <w:pPr>
+        <w:spacing w:after="1000"/>
+        <w:rPr>
+          <w:color w:val="555555"/>
+          <w:sz w:val="20"/>
+          <w:szCs w:val="20"/>
+        </w:rPr>
+      </w:pPr>
     </w:p>
     <w:sectPr>
-      <w:headerReference w:type="even" r:id="rId8"/>
-      <w:headerReference w:type="default" r:id="rId9"/>
-      <w:footerReference w:type="even" r:id="rId10"/>
-      <w:footerReference w:type="default" r:id="rId11"/>
-      <w:headerReference w:type="first" r:id="rId12"/>
-      <w:footerReference w:type="first" r:id="rId13"/>
+      <w:headerReference w:type="even" r:id="rId10"/>
+      <w:headerReference w:type="default" r:id="rId11"/>
+      <w:footerReference w:type="even" r:id="rId12"/>
+      <w:footerReference w:type="default" r:id="rId13"/>
+      <w:headerReference w:type="first" r:id="rId14"/>
+      <w:footerReference w:type="first" r:id="rId15"/>
       <w:pgSz w:w="11906" w:h="16838"/>
       <w:pgMar w:top="1000" w:right="1100" w:bottom="1000" w:left="1100" w:header="283" w:footer="708" w:gutter="0"/>
       <w:pgBorders w:offsetFrom="page">
@@ -1195,6 +1342,22 @@
     <w:uiPriority w:val="99"/>
     <w:rsid w:val="00D71B49"/>
   </w:style>
+  <w:style w:type="table" w:styleId="Tablaconcuadrcula">
+    <w:name w:val="Table Grid"/>
+    <w:basedOn w:val="Tablanormal"/>
+    <w:uiPriority w:val="39"/>
+    <w:rsid w:val="00451EB2"/>
+    <w:tblPr>
+      <w:tblBorders>
+        <w:top w:val="single" w:sz="4" w:space="0" w:color="auto"/>
+        <w:left w:val="single" w:sz="4" w:space="0" w:color="auto"/>
+        <w:bottom w:val="single" w:sz="4" w:space="0" w:color="auto"/>
+        <w:right w:val="single" w:sz="4" w:space="0" w:color="auto"/>
+        <w:insideH w:val="single" w:sz="4" w:space="0" w:color="auto"/>
+        <w:insideV w:val="single" w:sz="4" w:space="0" w:color="auto"/>
+      </w:tblBorders>
+    </w:tblPr>
+  </w:style>
 </w:styles>
 </file>
 
@@ -1511,4 +1674,16 @@
     </a:ext>
   </a:extLst>
 </a:theme>
+</file>
+
+<file path=customXml/item1.xml><?xml version="1.0" encoding="utf-8"?>
+<b:Sources xmlns:b="http://schemas.openxmlformats.org/officeDocument/2006/bibliography" xmlns="http://schemas.openxmlformats.org/officeDocument/2006/bibliography" SelectedStyle="\APASixthEditionOfficeOnline.xsl" StyleName="APA" Version="6"/>
+</file>
+
+<file path=customXml/itemProps1.xml><?xml version="1.0" encoding="utf-8"?>
+<ds:datastoreItem xmlns:ds="http://schemas.openxmlformats.org/officeDocument/2006/customXml" ds:itemID="{C59BD42A-BDD5-426A-95D8-06BB4F376C52}">
+  <ds:schemaRefs>
+    <ds:schemaRef ds:uri="http://schemas.openxmlformats.org/officeDocument/2006/bibliography"/>
+  </ds:schemaRefs>
+</ds:datastoreItem>
 </file>
</xml_diff>